<commit_message>
Add final professor presentation (14-slide PPTX) + enhanced model-logic doc
- Capstone8_Final_Presentation.pptx: 14-slide deck, Lowe's navy theme,
  visually QA'd (fixed card alignment, contrast, content nits)
- Capstone8_Full_Documentation.docx: added deep gradient-boosting
  mathematical intuition section

Co-Authored-By: Claude Opus 4.6 (1M context) <noreply@anthropic.com>
</commit_message>
<xml_diff>
--- a/outputs/Capstone8_Full_Documentation.docx
+++ b/outputs/Capstone8_Full_Documentation.docx
@@ -1015,6 +1015,196 @@
           <w:sz w:val="22"/>
         </w:rPr>
         <w:t>The simplest possible 'model': this week's sales = the same week last year. WAPE 8.27%. Any real model must beat this to justify its existence. Our final model is 15% better, which is the headline improvement story.</w:t>
+      </w:r>
+    </w:p>
+    <w:p>
+      <w:pPr>
+        <w:pStyle w:val="Heading2"/>
+      </w:pPr>
+      <w:r>
+        <w:rPr>
+          <w:b/>
+          <w:color w:val="0277BD"/>
+          <w:sz w:val="28"/>
+        </w:rPr>
+        <w:t>2.5  The Logic Behind the Models — Mathematical Intuition</w:t>
+      </w:r>
+    </w:p>
+    <w:p>
+      <w:r>
+        <w:rPr>
+          <w:b w:val="0"/>
+          <w:i w:val="0"/>
+          <w:sz w:val="22"/>
+        </w:rPr>
+        <w:t>This section explains WHY these models work, in plain terms, for the technical Q&amp;A.</w:t>
+      </w:r>
+    </w:p>
+    <w:p>
+      <w:pPr>
+        <w:pStyle w:val="Heading3"/>
+      </w:pPr>
+      <w:r>
+        <w:rPr>
+          <w:b/>
+          <w:color w:val="003087"/>
+          <w:sz w:val="24"/>
+        </w:rPr>
+        <w:t>Supervised Regression — the core idea</w:t>
+      </w:r>
+    </w:p>
+    <w:p>
+      <w:r>
+        <w:rPr>
+          <w:b w:val="0"/>
+          <w:i w:val="0"/>
+          <w:sz w:val="22"/>
+        </w:rPr>
+        <w:t>We are learning a function f such that f(X) ≈ y, where X is the 16-feature vector for a store-week and y is that week's Actual Sales USD. The model is given thousands of historical (X, y) pairs and adjusts itself to minimize the gap between its prediction ŷ = f(X) and the true y. 'Supervised' simply means every training example carries the correct answer (the label).</w:t>
+      </w:r>
+    </w:p>
+    <w:p>
+      <w:pPr>
+        <w:pStyle w:val="Heading3"/>
+      </w:pPr>
+      <w:r>
+        <w:rPr>
+          <w:b/>
+          <w:color w:val="003087"/>
+          <w:sz w:val="24"/>
+        </w:rPr>
+        <w:t>Why Gradient Boosting (XGBoost / LightGBM)</w:t>
+      </w:r>
+    </w:p>
+    <w:p>
+      <w:r>
+        <w:rPr>
+          <w:b w:val="0"/>
+          <w:i w:val="0"/>
+          <w:sz w:val="22"/>
+        </w:rPr>
+        <w:t>A single decision tree asks a series of yes/no questions ('Is lag_1 &gt; $900K?', then 'Is housing_new_share &gt; 5%?') and lands each store-week in a leaf with a predicted value. One tree is weak — it either oversimplifies or overfits. Gradient boosting fixes this by building an ENSEMBLE sequentially:</w:t>
+      </w:r>
+    </w:p>
+    <w:p>
+      <w:pPr>
+        <w:pStyle w:val="ListBullet"/>
+      </w:pPr>
+      <w:r>
+        <w:t>Tree 1 makes a rough prediction. We measure its error for every row (the residual = actual − predicted).</w:t>
+      </w:r>
+    </w:p>
+    <w:p>
+      <w:pPr>
+        <w:pStyle w:val="ListBullet"/>
+      </w:pPr>
+      <w:r>
+        <w:t>Tree 2 is trained NOT on sales, but on Tree 1's residuals — it learns to predict 'where Tree 1 was wrong'.</w:t>
+      </w:r>
+    </w:p>
+    <w:p>
+      <w:pPr>
+        <w:pStyle w:val="ListBullet"/>
+      </w:pPr>
+      <w:r>
+        <w:t>Tree 3 corrects what Tree 1+2 still get wrong, and so on for 500 trees.</w:t>
+      </w:r>
+    </w:p>
+    <w:p>
+      <w:pPr>
+        <w:pStyle w:val="ListBullet"/>
+      </w:pPr>
+      <w:r>
+        <w:t>Final prediction = Tree 1 + 0.05×Tree 2 + 0.05×Tree 3 + … (the 0.05 is the learning rate — small steps avoid overshooting).</w:t>
+      </w:r>
+    </w:p>
+    <w:p>
+      <w:r>
+        <w:rPr>
+          <w:b w:val="0"/>
+          <w:i w:val="0"/>
+          <w:sz w:val="22"/>
+        </w:rPr>
+        <w:t>Formally, at each step m the model adds the tree h_m that best reduces the loss L: F_m(x) = F_{m-1}(x) + ν · h_m(x), where h_m is fit to the negative gradient of L with respect to F_{m-1} (hence 'gradient' boosting). With squared-error loss the negative gradient is exactly the residual, which is why the intuition above is precise, not just an analogy.</w:t>
+      </w:r>
+    </w:p>
+    <w:p>
+      <w:r>
+        <w:rPr>
+          <w:b w:val="0"/>
+          <w:i w:val="0"/>
+          <w:sz w:val="22"/>
+        </w:rPr>
+        <w:t>Why it beats a linear model here: sales depend on INTERACTIONS — e.g., high income matters more in a fast-growing housing market with low competition. Trees capture these 'if-and-and' combinations automatically; a linear model would need every interaction term specified by hand.</w:t>
+      </w:r>
+    </w:p>
+    <w:p>
+      <w:pPr>
+        <w:pStyle w:val="Heading3"/>
+      </w:pPr>
+      <w:r>
+        <w:rPr>
+          <w:b/>
+          <w:color w:val="003087"/>
+          <w:sz w:val="24"/>
+        </w:rPr>
+        <w:t>Why XGBoost over LightGBM (both gradient boosting)</w:t>
+      </w:r>
+    </w:p>
+    <w:p>
+      <w:r>
+        <w:rPr>
+          <w:b w:val="0"/>
+          <w:i w:val="0"/>
+          <w:sz w:val="22"/>
+        </w:rPr>
+        <w:t>XGBoost grows each tree level-by-level (all nodes at a depth split before going deeper) and adds an explicit regularization term (γ, λ) penalizing tree complexity. LightGBM grows leaf-by-leaf (always split the leaf with the biggest loss gain) — faster, but slightly more prone to overfitting on smaller signals. On our holdout XGBoost edged ahead on WAPE and bias, so it is the production choice; LightGBM's near-identical score is our robustness check.</w:t>
+      </w:r>
+    </w:p>
+    <w:p>
+      <w:pPr>
+        <w:pStyle w:val="Heading3"/>
+      </w:pPr>
+      <w:r>
+        <w:rPr>
+          <w:b/>
+          <w:color w:val="003087"/>
+          <w:sz w:val="24"/>
+        </w:rPr>
+        <w:t>Why Ridge as the linear control</w:t>
+      </w:r>
+    </w:p>
+    <w:p>
+      <w:r>
+        <w:rPr>
+          <w:b w:val="0"/>
+          <w:i w:val="0"/>
+          <w:sz w:val="22"/>
+        </w:rPr>
+        <w:t>Ordinary linear regression becomes unstable when inputs are correlated (our lag features are highly correlated with each other). Ridge adds an L2 penalty λ·Σβ² to the loss, which shrinks coefficients toward zero and stabilizes them. It answers the question: 'Is the expensive non-linear model actually necessary?' Ridge reaching 7.11% tells us lags make the problem nearly linear, but XGBoost's edge confirms the market interactions are real and worth modeling.</w:t>
+      </w:r>
+    </w:p>
+    <w:p>
+      <w:pPr>
+        <w:pStyle w:val="Heading3"/>
+      </w:pPr>
+      <w:r>
+        <w:rPr>
+          <w:b/>
+          <w:color w:val="003087"/>
+          <w:sz w:val="24"/>
+        </w:rPr>
+        <w:t>Why WAPE as the headline metric</w:t>
+      </w:r>
+    </w:p>
+    <w:p>
+      <w:r>
+        <w:rPr>
+          <w:b w:val="0"/>
+          <w:i w:val="0"/>
+          <w:sz w:val="22"/>
+        </w:rPr>
+        <w:t>WAPE = Σ|actual − predicted| / Σ(actual). Unlike MAPE, it weights each error by sales volume, so a $1K miss at a $50M store does not count the same as a $1K miss at a $1M store — exactly how a planner thinks about dollar risk. Bias = (Σpred − Σactual)/Σactual measures systematic direction (does the model habitually over- or under-commit?). R² measures the share of sales variation explained. We require all three to pass, not just one.</w:t>
       </w:r>
     </w:p>
     <w:p>

</xml_diff>